<commit_message>
Redesign resume & cover letter: professional layout, richer content, live links, no em dashes
Co-Authored-By: Claude Opus 4.8 <noreply@anthropic.com>
Claude-Session: https://claude.ai/code/session_01MGPZcXnveR1LfyWB2KFgzx
</commit_message>
<xml_diff>
--- a/programs-application/Garvit_Saraf_Cover_Letter.docx
+++ b/programs-application/Garvit_Saraf_Cover_Letter.docx
@@ -4,14 +4,15 @@
   <w:body>
     <w:p>
       <w:pPr>
-        <w:spacing w:after="10"/>
-      </w:pPr>
-      <w:r>
-        <w:rPr>
-          <w:rFonts w:ascii="Calibri" w:cs="Calibri" w:eastAsia="Calibri" w:hAnsi="Calibri"/>
+        <w:spacing w:after="40"/>
+      </w:pPr>
+      <w:r>
+        <w:rPr>
+          <w:rFonts w:ascii="Arial" w:cs="Arial" w:eastAsia="Arial" w:hAnsi="Arial"/>
           <w:b/>
           <w:bCs/>
-          <w:color w:val="1F3864"/>
+          <w:color w:val="1C3A5E"/>
+          <w:spacing w:val="80"/>
           <w:sz w:val="34"/>
           <w:szCs w:val="34"/>
         </w:rPr>
@@ -21,152 +22,347 @@
     <w:p>
       <w:pPr>
         <w:pBdr>
-          <w:bottom w:val="single" w:color="1F3864" w:sz="6"/>
+          <w:bottom w:val="single" w:color="1C3A5E" w:sz="12"/>
         </w:pBdr>
         <w:spacing w:after="60"/>
       </w:pPr>
       <w:r>
         <w:rPr>
-          <w:color w:val="555555"/>
-          <w:sz w:val="18"/>
-          <w:szCs w:val="18"/>
-        </w:rPr>
-        <w:t xml:space="preserve">Bengaluru, India  •  garvitsaraf28@gmail.com  •  +91 97921 21111  •  linkedin.com/in/garvit-saraf</w:t>
-      </w:r>
-    </w:p>
-    <w:p>
-      <w:pPr>
-        <w:spacing w:after="200"/>
-      </w:pPr>
-      <w:r>
-        <w:rPr>
+          <w:rFonts w:ascii="Arial" w:cs="Arial" w:eastAsia="Arial" w:hAnsi="Arial"/>
+          <w:color w:val="5C5C5C"/>
+          <w:sz w:val="17"/>
+          <w:szCs w:val="17"/>
+        </w:rPr>
+        <w:t xml:space="preserve">Sales Associate, GrowthSchool / Outskill   |   +91 97921 21111   |   garvitsaraf28@gmail.com</w:t>
+      </w:r>
+    </w:p>
+    <w:p>
+      <w:pPr>
+        <w:spacing w:after="160"/>
+      </w:pPr>
+      <w:r>
+        <w:rPr>
+          <w:rFonts w:ascii="Arial" w:cs="Arial" w:eastAsia="Arial" w:hAnsi="Arial"/>
+          <w:color w:val="5C5C5C"/>
+          <w:sz w:val="20"/>
+          <w:szCs w:val="20"/>
+        </w:rPr>
+        <w:t xml:space="preserve">24 July 2026</w:t>
+      </w:r>
+    </w:p>
+    <w:p>
+      <w:pPr>
+        <w:spacing w:after="160"/>
+      </w:pPr>
+      <w:r>
+        <w:rPr>
+          <w:rFonts w:ascii="Arial" w:cs="Arial" w:eastAsia="Arial" w:hAnsi="Arial"/>
+          <w:sz w:val="21"/>
+          <w:szCs w:val="21"/>
+        </w:rPr>
+        <w:t xml:space="preserve">Dear Dileep and the Programs Team,</w:t>
+      </w:r>
+    </w:p>
+    <w:p>
+      <w:pPr>
+        <w:spacing w:after="170" w:line="288"/>
+        <w:jc w:val="left"/>
+      </w:pPr>
+      <w:r>
+        <w:rPr>
+          <w:rFonts w:ascii="Arial" w:cs="Arial" w:eastAsia="Arial" w:hAnsi="Arial"/>
+          <w:sz w:val="21"/>
+          <w:szCs w:val="21"/>
+        </w:rPr>
+        <w:t xml:space="preserve">In my first full month carrying a target at Outskill, I delivered Rs. 9.7L against a Rs. 7.5L goal. In the weeks after, I built something no one asked me to build, and it is the reason I am writing to you.</w:t>
+      </w:r>
+    </w:p>
+    <w:p>
+      <w:pPr>
+        <w:spacing w:after="170" w:line="288"/>
+        <w:jc w:val="left"/>
+      </w:pPr>
+      <w:r>
+        <w:rPr>
+          <w:rFonts w:ascii="Arial" w:cs="Arial" w:eastAsia="Arial" w:hAnsi="Arial"/>
+          <w:sz w:val="21"/>
+          <w:szCs w:val="21"/>
+        </w:rPr>
+        <w:t xml:space="preserve">I noticed that every new sales hire was trained personally by a senior rep or a manager. That meant our strongest closers were spending their selling hours repeating the same product walkthrough, and every new joiner picked up a slightly different version of it. The cost was invisible but real: less revenue from our best people, and inconsistent product knowledge on the floor.</w:t>
+      </w:r>
+    </w:p>
+    <w:p>
+      <w:pPr>
+        <w:spacing w:after="170" w:line="288"/>
+        <w:jc w:val="left"/>
+      </w:pPr>
+      <w:r>
+        <w:rPr>
+          <w:rFonts w:ascii="Arial" w:cs="Arial" w:eastAsia="Arial" w:hAnsi="Arial"/>
+          <w:sz w:val="21"/>
+          <w:szCs w:val="21"/>
+        </w:rPr>
+        <w:t xml:space="preserve">So I spent six hours structuring everything we know, our programs, our pitch, our objection handling, and our funnel logic, into a sequenced curriculum, and then taught myself to build on top of it using Claude. Over the next two to three weeks I shipped an AI-powered onboarding platform where a new joiner runs live voice mock calls against an AI buyer, receives automated scoring on the pitch, and gets coaching feedback after every attempt, including on their real calls once they go live. Managers see a dashboard of mock-call volume, scores, strengths, improvement areas, and next steps. It is now formally recognised and rolling out, starting with the Hyderabad office.</w:t>
+      </w:r>
+    </w:p>
+    <w:p>
+      <w:pPr>
+        <w:spacing w:after="170" w:line="288"/>
+        <w:jc w:val="left"/>
+      </w:pPr>
+      <w:r>
+        <w:rPr>
+          <w:rFonts w:ascii="Arial" w:cs="Arial" w:eastAsia="Arial" w:hAnsi="Arial"/>
+          <w:sz w:val="21"/>
+          <w:szCs w:val="21"/>
+        </w:rPr>
+        <w:t xml:space="preserve">That project taught me what I actually want to do. Building it was not a sales task. It was curriculum design, learning experience design, and assessment design. And I kept going. I redesigned Day-1 into a sixteen-session program, mapped every session to an owner and duration across HR, Finance, Sales, Growth, Acquisition, Community, and Support, and briefed each owner on what their session needed to cover. I then built the company induction, the POSH and leave policy modules, and a full five-program curriculum reference covering our funnel stages, program structures, and learner pathways.</w:t>
+      </w:r>
+    </w:p>
+    <w:p>
+      <w:pPr>
+        <w:spacing w:after="170" w:line="288"/>
+        <w:jc w:val="left"/>
+      </w:pPr>
+      <w:r>
+        <w:rPr>
+          <w:rFonts w:ascii="Arial" w:cs="Arial" w:eastAsia="Arial" w:hAnsi="Arial"/>
+          <w:sz w:val="21"/>
+          <w:szCs w:val="21"/>
+        </w:rPr>
+        <w:t xml:space="preserve">None of that was assigned to me. I built it because "be an owner, not a renter" is not a slide to me. It is the only way I know how to work. And the reason I want the Programs Team specifically is that everything I enjoyed most about those projects is what Programs does every day: researching what should be taught, structuring it into a curriculum, designing how learners actually experience it, and running the delivery so nothing slips.</w:t>
+      </w:r>
+    </w:p>
+    <w:p>
+      <w:pPr>
+        <w:spacing w:after="170" w:line="288"/>
+        <w:jc w:val="left"/>
+      </w:pPr>
+      <w:r>
+        <w:rPr>
+          <w:rFonts w:ascii="Arial" w:cs="Arial" w:eastAsia="Arial" w:hAnsi="Arial"/>
+          <w:sz w:val="21"/>
+          <w:szCs w:val="21"/>
+        </w:rPr>
+        <w:t xml:space="preserve">What I would bring is a rare combination for an early-career hire. I understand our programs commercially, because I have sold them. I know why a learner chooses the Accelerator over a Fellowship, and what they expect when they arrive. I can build learning experiences on my own, without waiting on design or engineering. And I work in data by default, from the Dial Nexa performance dashboard to the weekly revenue and funnel analysis I produce for the Senior Manager, Business Operations and the Associate Director, Growth.</w:t>
+      </w:r>
+    </w:p>
+    <w:p>
+      <w:pPr>
+        <w:spacing w:after="170" w:line="288"/>
+        <w:jc w:val="left"/>
+      </w:pPr>
+      <w:r>
+        <w:rPr>
+          <w:rFonts w:ascii="Arial" w:cs="Arial" w:eastAsia="Arial" w:hAnsi="Arial"/>
+          <w:sz w:val="21"/>
+          <w:szCs w:val="21"/>
+        </w:rPr>
+        <w:t xml:space="preserve">I have spent three months quietly doing Programs work alongside my quota. I would like to do it properly, full-time, for the learners it is ultimately built for.</w:t>
+      </w:r>
+    </w:p>
+    <w:p>
+      <w:pPr>
+        <w:spacing w:after="170" w:line="288"/>
+        <w:jc w:val="left"/>
+      </w:pPr>
+      <w:r>
+        <w:rPr>
+          <w:rFonts w:ascii="Arial" w:cs="Arial" w:eastAsia="Arial" w:hAnsi="Arial"/>
+          <w:sz w:val="21"/>
+          <w:szCs w:val="21"/>
+        </w:rPr>
+        <w:t xml:space="preserve">Thank you for considering my application. I would welcome the chance to walk you through the platform and what I would build next.</w:t>
+      </w:r>
+    </w:p>
+    <w:p>
+      <w:pPr>
+        <w:spacing w:after="0" w:before="60"/>
+      </w:pPr>
+      <w:r>
+        <w:rPr>
+          <w:rFonts w:ascii="Arial" w:cs="Arial" w:eastAsia="Arial" w:hAnsi="Arial"/>
+          <w:sz w:val="21"/>
+          <w:szCs w:val="21"/>
+        </w:rPr>
+        <w:t xml:space="preserve">Warm regards,</w:t>
+      </w:r>
+    </w:p>
+    <w:p>
+      <w:pPr>
+        <w:spacing w:after="160" w:before="30"/>
+      </w:pPr>
+      <w:r>
+        <w:rPr>
+          <w:rFonts w:ascii="Arial" w:cs="Arial" w:eastAsia="Arial" w:hAnsi="Arial"/>
           <w:b/>
           <w:bCs/>
-          <w:sz w:val="21"/>
-          <w:szCs w:val="21"/>
-        </w:rPr>
-        <w:t xml:space="preserve">Application for the Programs Team — Internal Transfer</w:t>
-      </w:r>
-    </w:p>
-    <w:p>
-      <w:pPr>
-        <w:spacing w:after="200"/>
-      </w:pPr>
-      <w:r>
-        <w:rPr>
-          <w:sz w:val="21"/>
-          <w:szCs w:val="21"/>
-        </w:rPr>
-        <w:t xml:space="preserve">Dear Hiring Manager,</w:t>
-      </w:r>
-    </w:p>
-    <w:p>
-      <w:pPr>
-        <w:spacing w:after="200" w:line="276"/>
-        <w:jc w:val="both"/>
-      </w:pPr>
-      <w:r>
-        <w:rPr>
-          <w:sz w:val="21"/>
-          <w:szCs w:val="21"/>
-        </w:rPr>
-        <w:t xml:space="preserve">I joined Outskill's Sales team in April, and over the last three months I've realised that the work I'm proudest of has been Programs work in everything but title. I'm writing to formally express my interest in moving to the Programs Team.</w:t>
-      </w:r>
-    </w:p>
-    <w:p>
-      <w:pPr>
-        <w:spacing w:after="200" w:line="276"/>
-        <w:jc w:val="both"/>
-      </w:pPr>
-      <w:r>
-        <w:rPr>
-          <w:sz w:val="21"/>
-          <w:szCs w:val="21"/>
-        </w:rPr>
-        <w:t xml:space="preserve">When I completed the Accelerator as part of my onboarding and then had to build a project, I chose to solve a problem I had felt first-hand: new sales hires were trained by pulling senior reps, managers, and management into repeated manual mock-calls — expensive, inconsistent, and hard to scale. I designed and built OutSkill Training, an 11-level AI onboarding platform that takes a new joiner from company foundations through to live, AI-scored mock-calls against realistic buyer personas, with progress reports managers can act on. It is now live with our Hyderabad team and approved for wider adoption. Building it meant doing the core of what Programs does: researching the curriculum, sequencing what to teach and when, designing assessments, and shaping the delivery experience.</w:t>
-      </w:r>
-    </w:p>
-    <w:p>
-      <w:pPr>
-        <w:spacing w:after="200" w:line="276"/>
-        <w:jc w:val="both"/>
-      </w:pPr>
-      <w:r>
-        <w:rPr>
-          <w:sz w:val="21"/>
-          <w:szCs w:val="21"/>
-        </w:rPr>
-        <w:t xml:space="preserve">Alongside it, I researched and wrote the company's single-source-of-truth Programs deck — mapping every program, pricing journey, and learner path across the business — and produced the onboarding decks now used in our inductions. I also automated our manual revenue reporting into a live dashboard and built the performance analytics leadership uses to make coaching decisions.</w:t>
-      </w:r>
-    </w:p>
-    <w:p>
-      <w:pPr>
-        <w:spacing w:after="200" w:line="276"/>
-        <w:jc w:val="both"/>
-      </w:pPr>
-      <w:r>
-        <w:rPr>
-          <w:sz w:val="21"/>
-          <w:szCs w:val="21"/>
-        </w:rPr>
-        <w:t xml:space="preserve">I want to join Programs because that is where my instincts already pull me: understanding a learner's journey, researching and structuring what they need to learn, and building the systems and documentation that let a program run and scale well. Having gone through the Accelerator myself, I know the learner experience from the inside — and having sold it, I understand the promise we make to students and the standard the program has to meet.</w:t>
-      </w:r>
-    </w:p>
-    <w:p>
-      <w:pPr>
-        <w:spacing w:after="200" w:line="276"/>
-        <w:jc w:val="both"/>
-      </w:pPr>
-      <w:r>
-        <w:rPr>
-          <w:sz w:val="21"/>
-          <w:szCs w:val="21"/>
-        </w:rPr>
-        <w:t xml:space="preserve">I would welcome the chance to bring that mix — learner empathy, curriculum and content research, operations discipline, and AI fluency — to the Programs Team, and to help design and deliver programs students remember.</w:t>
-      </w:r>
-    </w:p>
-    <w:p>
-      <w:pPr>
-        <w:spacing w:after="200" w:line="276"/>
-        <w:jc w:val="both"/>
-      </w:pPr>
-      <w:r>
-        <w:rPr>
-          <w:sz w:val="21"/>
-          <w:szCs w:val="21"/>
-        </w:rPr>
-        <w:t xml:space="preserve">Thank you for considering my application.</w:t>
-      </w:r>
-    </w:p>
-    <w:p>
-      <w:pPr>
-        <w:spacing w:after="0" w:before="100"/>
-      </w:pPr>
-      <w:r>
-        <w:rPr>
-          <w:sz w:val="21"/>
-          <w:szCs w:val="21"/>
-        </w:rPr>
-        <w:t xml:space="preserve">Warm regards,</w:t>
-      </w:r>
-    </w:p>
-    <w:p>
-      <w:pPr>
-        <w:spacing w:after="0" w:before="40"/>
-      </w:pPr>
-      <w:r>
-        <w:rPr>
+          <w:color w:val="1A1A1A"/>
+          <w:sz w:val="21"/>
+          <w:szCs w:val="21"/>
+        </w:rPr>
+        <w:t xml:space="preserve">Garvit Saraf</w:t>
+      </w:r>
+    </w:p>
+    <w:p>
+      <w:pPr>
+        <w:pBdr>
+          <w:top w:val="single" w:color="B9C4D4" w:sz="5"/>
+        </w:pBdr>
+        <w:spacing w:after="40" w:before="60"/>
+      </w:pPr>
+      <w:r>
+        <w:rPr>
+          <w:rFonts w:ascii="Arial" w:cs="Arial" w:eastAsia="Arial" w:hAnsi="Arial"/>
           <w:b/>
           <w:bCs/>
-          <w:sz w:val="21"/>
-          <w:szCs w:val="21"/>
-        </w:rPr>
-        <w:t xml:space="preserve">Garvit Saraf</w:t>
-      </w:r>
+          <w:color w:val="1C3A5E"/>
+          <w:spacing w:val="20"/>
+          <w:sz w:val="16"/>
+          <w:szCs w:val="16"/>
+        </w:rPr>
+        <w:t xml:space="preserve">SEE THE WORK, LIVE</w:t>
+      </w:r>
+    </w:p>
+    <w:p>
+      <w:pPr>
+        <w:spacing w:after="30"/>
+      </w:pPr>
+      <w:r>
+        <w:rPr>
+          <w:rFonts w:ascii="Arial" w:cs="Arial" w:eastAsia="Arial" w:hAnsi="Arial"/>
+          <w:color w:val="5C5C5C"/>
+          <w:sz w:val="17"/>
+          <w:szCs w:val="17"/>
+        </w:rPr>
+        <w:t xml:space="preserve">Onboarding platform and mock-call demo: </w:t>
+      </w:r>
+      <w:hyperlink w:history="1" r:id="rIden7knsx5jg47n-wqbpfiy">
+        <w:r>
+          <w:rPr>
+            <w:rFonts w:ascii="Arial" w:cs="Arial" w:eastAsia="Arial" w:hAnsi="Arial"/>
+            <w:color w:val="1C3A5E"/>
+            <w:sz w:val="17"/>
+            <w:szCs w:val="17"/>
+            <w:u w:val="single"/>
+          </w:rPr>
+          <w:t xml:space="preserve">outskill-garvit.vercel.app</w:t>
+        </w:r>
+      </w:hyperlink>
+    </w:p>
+    <w:p>
+      <w:pPr>
+        <w:spacing w:after="0"/>
+      </w:pPr>
+      <w:r>
+        <w:rPr>
+          <w:rFonts w:ascii="Arial" w:cs="Arial" w:eastAsia="Arial" w:hAnsi="Arial"/>
+          <w:color w:val="5C5C5C"/>
+          <w:sz w:val="17"/>
+          <w:szCs w:val="17"/>
+        </w:rPr>
+        <w:t xml:space="preserve">Day-1 program: </w:t>
+      </w:r>
+      <w:hyperlink w:history="1" r:id="rIdnmhpefdn99rtofpj-gcxz">
+        <w:r>
+          <w:rPr>
+            <w:rFonts w:ascii="Arial" w:cs="Arial" w:eastAsia="Arial" w:hAnsi="Arial"/>
+            <w:color w:val="1C3A5E"/>
+            <w:sz w:val="17"/>
+            <w:szCs w:val="17"/>
+            <w:u w:val="single"/>
+          </w:rPr>
+          <w:t xml:space="preserve">/day1</w:t>
+        </w:r>
+      </w:hyperlink>
+      <w:r>
+        <w:rPr>
+          <w:rFonts w:ascii="Arial" w:cs="Arial" w:eastAsia="Arial" w:hAnsi="Arial"/>
+          <w:color w:val="5C5C5C"/>
+          <w:sz w:val="17"/>
+          <w:szCs w:val="17"/>
+        </w:rPr>
+        <w:t xml:space="preserve">   |   Company induction: </w:t>
+      </w:r>
+      <w:hyperlink w:history="1" r:id="rIdv0mdztvuxo_gzs_zfhd0h">
+        <w:r>
+          <w:rPr>
+            <w:rFonts w:ascii="Arial" w:cs="Arial" w:eastAsia="Arial" w:hAnsi="Arial"/>
+            <w:color w:val="1C3A5E"/>
+            <w:sz w:val="17"/>
+            <w:szCs w:val="17"/>
+            <w:u w:val="single"/>
+          </w:rPr>
+          <w:t xml:space="preserve">/induction</w:t>
+        </w:r>
+      </w:hyperlink>
+      <w:r>
+        <w:rPr>
+          <w:rFonts w:ascii="Arial" w:cs="Arial" w:eastAsia="Arial" w:hAnsi="Arial"/>
+          <w:color w:val="5C5C5C"/>
+          <w:sz w:val="17"/>
+          <w:szCs w:val="17"/>
+        </w:rPr>
+        <w:t xml:space="preserve">   |   Curriculum reference: </w:t>
+      </w:r>
+      <w:hyperlink w:history="1" r:id="rIdkamz7v-ijwxbnet2cazqp">
+        <w:r>
+          <w:rPr>
+            <w:rFonts w:ascii="Arial" w:cs="Arial" w:eastAsia="Arial" w:hAnsi="Arial"/>
+            <w:color w:val="1C3A5E"/>
+            <w:sz w:val="17"/>
+            <w:szCs w:val="17"/>
+            <w:u w:val="single"/>
+          </w:rPr>
+          <w:t xml:space="preserve">/programs</w:t>
+        </w:r>
+      </w:hyperlink>
+      <w:r>
+        <w:rPr>
+          <w:rFonts w:ascii="Arial" w:cs="Arial" w:eastAsia="Arial" w:hAnsi="Arial"/>
+          <w:color w:val="5C5C5C"/>
+          <w:sz w:val="17"/>
+          <w:szCs w:val="17"/>
+        </w:rPr>
+        <w:t xml:space="preserve">   |   Policy modules: </w:t>
+      </w:r>
+      <w:hyperlink w:history="1" r:id="rIdja0zq_olfryouwtp3tjf_">
+        <w:r>
+          <w:rPr>
+            <w:rFonts w:ascii="Arial" w:cs="Arial" w:eastAsia="Arial" w:hAnsi="Arial"/>
+            <w:color w:val="1C3A5E"/>
+            <w:sz w:val="17"/>
+            <w:szCs w:val="17"/>
+            <w:u w:val="single"/>
+          </w:rPr>
+          <w:t xml:space="preserve">/posh</w:t>
+        </w:r>
+      </w:hyperlink>
+      <w:r>
+        <w:rPr>
+          <w:rFonts w:ascii="Arial" w:cs="Arial" w:eastAsia="Arial" w:hAnsi="Arial"/>
+          <w:color w:val="5C5C5C"/>
+          <w:sz w:val="17"/>
+          <w:szCs w:val="17"/>
+        </w:rPr>
+        <w:t xml:space="preserve">, </w:t>
+      </w:r>
+      <w:hyperlink w:history="1" r:id="rIdno9f1k5ozzmnmpu0axale">
+        <w:r>
+          <w:rPr>
+            <w:rFonts w:ascii="Arial" w:cs="Arial" w:eastAsia="Arial" w:hAnsi="Arial"/>
+            <w:color w:val="1C3A5E"/>
+            <w:sz w:val="17"/>
+            <w:szCs w:val="17"/>
+            <w:u w:val="single"/>
+          </w:rPr>
+          <w:t xml:space="preserve">/leave</w:t>
+        </w:r>
+      </w:hyperlink>
     </w:p>
     <w:sectPr>
       <w:pgSz w:w="11906" w:h="16838" w:orient="portrait"/>
-      <w:pgMar w:top="900" w:right="1080" w:bottom="900" w:left="1080" w:header="708" w:footer="708" w:gutter="0"/>
+      <w:pgMar w:top="850" w:right="1120" w:bottom="780" w:left="1120" w:header="708" w:footer="708" w:gutter="0"/>
       <w:pgNumType/>
       <w:docGrid w:linePitch="360"/>
     </w:sectPr>
@@ -336,6 +532,20 @@
       <w:pPr>
         <w:ind w:left="6480" w:hanging="360"/>
       </w:pPr>
+    </w:lvl>
+  </w:abstractNum>
+  <w:abstractNum w:abstractNumId="2" w15:restartNumberingAfterBreak="0">
+    <w:multiLevelType w:val="hybridMultilevel"/>
+    <w:lvl w:ilvl="0" w15:tentative="1">
+      <w:start w:val="1"/>
+      <w:numFmt w:val="bullet"/>
+      <w:lvlText w:val="▪"/>
+      <w:lvlJc w:val="left"/>
+      <w:rPr>
+        <w:color w:val="1C3A5E"/>
+        <w:sz w:val="16"/>
+        <w:szCs w:val="16"/>
+      </w:rPr>
     </w:lvl>
   </w:abstractNum>
   <w:num w:numId="1">
@@ -352,8 +562,8 @@
   <w:docDefaults>
     <w:rPrDefault>
       <w:rPr>
-        <w:rFonts w:ascii="Calibri" w:cs="Calibri" w:eastAsia="Calibri" w:hAnsi="Calibri"/>
-        <w:color w:val="222222"/>
+        <w:rFonts w:ascii="Arial" w:cs="Arial" w:eastAsia="Arial" w:hAnsi="Arial"/>
+        <w:color w:val="252525"/>
         <w:sz w:val="21"/>
         <w:szCs w:val="21"/>
       </w:rPr>

</xml_diff>

<commit_message>
Elevate resume & cover letter: impact strip, results-first bullets, fresh voice; refresh deliverables
Co-Authored-By: Claude Opus 4.8 <noreply@anthropic.com>
Claude-Session: https://claude.ai/code/session_01MGPZcXnveR1LfyWB2KFgzx
</commit_message>
<xml_diff>
--- a/programs-application/Garvit_Saraf_Cover_Letter.docx
+++ b/programs-application/Garvit_Saraf_Cover_Letter.docx
@@ -74,7 +74,7 @@
           <w:sz w:val="21"/>
           <w:szCs w:val="21"/>
         </w:rPr>
-        <w:t xml:space="preserve">In my first full month carrying a target at Outskill, I delivered Rs. 9.7L against a Rs. 7.5L goal. In the weeks after, I built something no one asked me to build, and it is the reason I am writing to you.</w:t>
+        <w:t xml:space="preserve">In my first full month carrying a target, I closed Rs. 9.7L against a Rs. 7.5L goal. In the weeks that followed I built something nobody asked me to build, and it is the reason I am writing to you.</w:t>
       </w:r>
     </w:p>
     <w:p>
@@ -88,7 +88,7 @@
           <w:sz w:val="21"/>
           <w:szCs w:val="21"/>
         </w:rPr>
-        <w:t xml:space="preserve">I noticed that every new sales hire was trained personally by a senior rep or a manager. That meant our strongest closers were spending their selling hours repeating the same product walkthrough, and every new joiner picked up a slightly different version of it. The cost was invisible but real: less revenue from our best people, and inconsistent product knowledge on the floor.</w:t>
+        <w:t xml:space="preserve">Here is what I had noticed. Every new hire was trained hand to hand by a senior rep or a manager, which pulled our best closers off the phones to repeat the same walkthrough, and each joiner still reached the floor knowing a slightly different version of the pitch. The cost was quiet but real: lost revenue from our strongest people, and uneven product knowledge across the team.</w:t>
       </w:r>
     </w:p>
     <w:p>
@@ -102,7 +102,7 @@
           <w:sz w:val="21"/>
           <w:szCs w:val="21"/>
         </w:rPr>
-        <w:t xml:space="preserve">So I spent six hours structuring everything we know, our programs, our pitch, our objection handling, and our funnel logic, into a sequenced curriculum, and then taught myself to build on top of it using Claude. Over the next two to three weeks I shipped an AI-powered onboarding platform where a new joiner runs live voice mock calls against an AI buyer, receives automated scoring on the pitch, and gets coaching feedback after every attempt, including on their real calls once they go live. Managers see a dashboard of mock-call volume, scores, strengths, improvement areas, and next steps. It is now formally recognised and rolling out, starting with the Hyderabad office.</w:t>
+        <w:t xml:space="preserve">So I spent six hours pulling everything we know, our programs, our pitch, our objection handling, and our funnel logic, into one sequenced curriculum, then taught myself to build on top of it with Claude. Two to three weeks later I had shipped an AI onboarding platform where a joiner runs live voice mock calls against an AI buyer, is scored on the pitch automatically, and gets coaching after every attempt, including on their real calls once they go live. Managers get a dashboard of mock-call volume, scores, strengths, gaps, and next steps. It is now formally recognised and rolling out, beginning with Hyderabad.</w:t>
       </w:r>
     </w:p>
     <w:p>
@@ -116,7 +116,7 @@
           <w:sz w:val="21"/>
           <w:szCs w:val="21"/>
         </w:rPr>
-        <w:t xml:space="preserve">That project taught me what I actually want to do. Building it was not a sales task. It was curriculum design, learning experience design, and assessment design. And I kept going. I redesigned Day-1 into a sixteen-session program, mapped every session to an owner and duration across HR, Finance, Sales, Growth, Acquisition, Community, and Support, and briefed each owner on what their session needed to cover. I then built the company induction, the POSH and leave policy modules, and a full five-program curriculum reference covering our funnel stages, program structures, and learner pathways.</w:t>
+        <w:t xml:space="preserve">That build showed me what I actually want to do, because none of it was a sales task. It was curriculum design, learning experience design, and assessment design. And I did not stop there. I rebuilt Day-1 into a sixteen-session program across eight functions, gave every session an owner and a time slot, and briefed each owner on what theirs had to cover. Then I wrote the company induction, the POSH and leave modules, and a full five-program curriculum reference mapping our funnel stages, program structures, and learner pathways.</w:t>
       </w:r>
     </w:p>
     <w:p>
@@ -130,7 +130,7 @@
           <w:sz w:val="21"/>
           <w:szCs w:val="21"/>
         </w:rPr>
-        <w:t xml:space="preserve">None of that was assigned to me. I built it because "be an owner, not a renter" is not a slide to me. It is the only way I know how to work. And the reason I want the Programs Team specifically is that everything I enjoyed most about those projects is what Programs does every day: researching what should be taught, structuring it into a curriculum, designing how learners actually experience it, and running the delivery so nothing slips.</w:t>
+        <w:t xml:space="preserve">I built all of it because "be an owner, not a renter" is not a poster to me, it is simply how I work. And I want the Programs Team specifically because the parts I enjoyed most are exactly what Programs does every day: deciding what should be taught, shaping it into a curriculum, designing how a learner moves through it, and running delivery so nothing slips.</w:t>
       </w:r>
     </w:p>
     <w:p>
@@ -144,7 +144,7 @@
           <w:sz w:val="21"/>
           <w:szCs w:val="21"/>
         </w:rPr>
-        <w:t xml:space="preserve">What I would bring is a rare combination for an early-career hire. I understand our programs commercially, because I have sold them. I know why a learner chooses the Accelerator over a Fellowship, and what they expect when they arrive. I can build learning experiences on my own, without waiting on design or engineering. And I work in data by default, from the Dial Nexa performance dashboard to the weekly revenue and funnel analysis I produce for the Senior Manager, Business Operations and the Associate Director, Growth.</w:t>
+        <w:t xml:space="preserve">For an early-career hire I would bring an unusual mix. I know our programs commercially because I have sold them, so I understand why a learner picks the Accelerator over a Fellowship and what they expect on arrival. I can design and build a learning experience without waiting on design or engineering. And I work from data by default, from the Dial Nexa dashboard to the weekly revenue and funnel analysis I run for the Senior Manager, Business Operations and the Associate Director, Growth.</w:t>
       </w:r>
     </w:p>
     <w:p>
@@ -158,7 +158,7 @@
           <w:sz w:val="21"/>
           <w:szCs w:val="21"/>
         </w:rPr>
-        <w:t xml:space="preserve">I have spent three months quietly doing Programs work alongside my quota. I would like to do it properly, full-time, for the learners it is ultimately built for.</w:t>
+        <w:t xml:space="preserve">I have spent three months doing Programs work quietly, next to my quota. I would like to do it properly and full-time, for the learners it is all meant for.</w:t>
       </w:r>
     </w:p>
     <w:p>
@@ -172,7 +172,7 @@
           <w:sz w:val="21"/>
           <w:szCs w:val="21"/>
         </w:rPr>
-        <w:t xml:space="preserve">Thank you for considering my application. I would welcome the chance to walk you through the platform and what I would build next.</w:t>
+        <w:t xml:space="preserve">Thank you for reading. I would love to walk you through the platform and what I would build next.</w:t>
       </w:r>
     </w:p>
     <w:p>
@@ -237,7 +237,7 @@
         </w:rPr>
         <w:t xml:space="preserve">Onboarding platform and mock-call demo: </w:t>
       </w:r>
-      <w:hyperlink w:history="1" r:id="rIden7knsx5jg47n-wqbpfiy">
+      <w:hyperlink w:history="1" r:id="rIdkftfqasdhniul2gvsld7q">
         <w:r>
           <w:rPr>
             <w:rFonts w:ascii="Arial" w:cs="Arial" w:eastAsia="Arial" w:hAnsi="Arial"/>
@@ -263,7 +263,7 @@
         </w:rPr>
         <w:t xml:space="preserve">Day-1 program: </w:t>
       </w:r>
-      <w:hyperlink w:history="1" r:id="rIdnmhpefdn99rtofpj-gcxz">
+      <w:hyperlink w:history="1" r:id="rIdmcmnfnh6ekfkk0nv3an-h">
         <w:r>
           <w:rPr>
             <w:rFonts w:ascii="Arial" w:cs="Arial" w:eastAsia="Arial" w:hAnsi="Arial"/>
@@ -284,7 +284,7 @@
         </w:rPr>
         <w:t xml:space="preserve">   |   Company induction: </w:t>
       </w:r>
-      <w:hyperlink w:history="1" r:id="rIdv0mdztvuxo_gzs_zfhd0h">
+      <w:hyperlink w:history="1" r:id="rIdxo-ewonkezbj2o8_tn5eh">
         <w:r>
           <w:rPr>
             <w:rFonts w:ascii="Arial" w:cs="Arial" w:eastAsia="Arial" w:hAnsi="Arial"/>
@@ -305,7 +305,7 @@
         </w:rPr>
         <w:t xml:space="preserve">   |   Curriculum reference: </w:t>
       </w:r>
-      <w:hyperlink w:history="1" r:id="rIdkamz7v-ijwxbnet2cazqp">
+      <w:hyperlink w:history="1" r:id="rId1w7-1h12zvojhmonk21gj">
         <w:r>
           <w:rPr>
             <w:rFonts w:ascii="Arial" w:cs="Arial" w:eastAsia="Arial" w:hAnsi="Arial"/>
@@ -326,7 +326,7 @@
         </w:rPr>
         <w:t xml:space="preserve">   |   Policy modules: </w:t>
       </w:r>
-      <w:hyperlink w:history="1" r:id="rIdja0zq_olfryouwtp3tjf_">
+      <w:hyperlink w:history="1" r:id="rIdtqb_oqqblz2cso2bwnt5s">
         <w:r>
           <w:rPr>
             <w:rFonts w:ascii="Arial" w:cs="Arial" w:eastAsia="Arial" w:hAnsi="Arial"/>
@@ -347,7 +347,7 @@
         </w:rPr>
         <w:t xml:space="preserve">, </w:t>
       </w:r>
-      <w:hyperlink w:history="1" r:id="rIdno9f1k5ozzmnmpu0axale">
+      <w:hyperlink w:history="1" r:id="rIdutkbaqkyork6mnoiyzxyy">
         <w:r>
           <w:rPr>
             <w:rFonts w:ascii="Arial" w:cs="Arial" w:eastAsia="Arial" w:hAnsi="Arial"/>

</xml_diff>

<commit_message>
Rework resume (data analytics section, dates, Day-1 corrected) and 2-page cover letter; natural tone, no em dashes
Co-Authored-By: Claude Opus 4.8 <noreply@anthropic.com>
Claude-Session: https://claude.ai/code/session_01MGPZcXnveR1LfyWB2KFgzx
</commit_message>
<xml_diff>
--- a/programs-application/Garvit_Saraf_Cover_Letter.docx
+++ b/programs-application/Garvit_Saraf_Cover_Letter.docx
@@ -4,7 +4,7 @@
   <w:body>
     <w:p>
       <w:pPr>
-        <w:spacing w:after="40"/>
+        <w:spacing w:after="45"/>
       </w:pPr>
       <w:r>
         <w:rPr>
@@ -12,9 +12,9 @@
           <w:b/>
           <w:bCs/>
           <w:color w:val="1C3A5E"/>
-          <w:spacing w:val="80"/>
-          <w:sz w:val="34"/>
-          <w:szCs w:val="34"/>
+          <w:spacing w:val="70"/>
+          <w:sz w:val="36"/>
+          <w:szCs w:val="36"/>
         </w:rPr>
         <w:t xml:space="preserve">GARVIT SARAF</w:t>
       </w:r>
@@ -24,166 +24,194 @@
         <w:pBdr>
           <w:bottom w:val="single" w:color="1C3A5E" w:sz="12"/>
         </w:pBdr>
-        <w:spacing w:after="60"/>
+        <w:spacing w:after="70"/>
       </w:pPr>
       <w:r>
         <w:rPr>
           <w:rFonts w:ascii="Arial" w:cs="Arial" w:eastAsia="Arial" w:hAnsi="Arial"/>
           <w:color w:val="5C5C5C"/>
-          <w:sz w:val="17"/>
-          <w:szCs w:val="17"/>
+          <w:sz w:val="18"/>
+          <w:szCs w:val="18"/>
         </w:rPr>
         <w:t xml:space="preserve">Sales Associate, GrowthSchool / Outskill   |   +91 97921 21111   |   garvitsaraf28@gmail.com</w:t>
       </w:r>
     </w:p>
     <w:p>
       <w:pPr>
-        <w:spacing w:after="160"/>
+        <w:spacing w:after="180"/>
       </w:pPr>
       <w:r>
         <w:rPr>
           <w:rFonts w:ascii="Arial" w:cs="Arial" w:eastAsia="Arial" w:hAnsi="Arial"/>
           <w:color w:val="5C5C5C"/>
-          <w:sz w:val="20"/>
-          <w:szCs w:val="20"/>
-        </w:rPr>
-        <w:t xml:space="preserve">24 July 2026</w:t>
-      </w:r>
-    </w:p>
-    <w:p>
-      <w:pPr>
-        <w:spacing w:after="160"/>
-      </w:pPr>
-      <w:r>
-        <w:rPr>
-          <w:rFonts w:ascii="Arial" w:cs="Arial" w:eastAsia="Arial" w:hAnsi="Arial"/>
           <w:sz w:val="21"/>
           <w:szCs w:val="21"/>
         </w:rPr>
-        <w:t xml:space="preserve">Dear Dileep and the Programs Team,</w:t>
-      </w:r>
-    </w:p>
-    <w:p>
-      <w:pPr>
-        <w:spacing w:after="170" w:line="288"/>
-        <w:jc w:val="left"/>
-      </w:pPr>
-      <w:r>
-        <w:rPr>
-          <w:rFonts w:ascii="Arial" w:cs="Arial" w:eastAsia="Arial" w:hAnsi="Arial"/>
-          <w:sz w:val="21"/>
-          <w:szCs w:val="21"/>
-        </w:rPr>
-        <w:t xml:space="preserve">In my first full month carrying a target, I closed Rs. 9.7L against a Rs. 7.5L goal. In the weeks that followed I built something nobody asked me to build, and it is the reason I am writing to you.</w:t>
-      </w:r>
-    </w:p>
-    <w:p>
-      <w:pPr>
-        <w:spacing w:after="170" w:line="288"/>
-        <w:jc w:val="left"/>
-      </w:pPr>
-      <w:r>
-        <w:rPr>
-          <w:rFonts w:ascii="Arial" w:cs="Arial" w:eastAsia="Arial" w:hAnsi="Arial"/>
-          <w:sz w:val="21"/>
-          <w:szCs w:val="21"/>
-        </w:rPr>
-        <w:t xml:space="preserve">Here is what I had noticed. Every new hire was trained hand to hand by a senior rep or a manager, which pulled our best closers off the phones to repeat the same walkthrough, and each joiner still reached the floor knowing a slightly different version of the pitch. The cost was quiet but real: lost revenue from our strongest people, and uneven product knowledge across the team.</w:t>
-      </w:r>
-    </w:p>
-    <w:p>
-      <w:pPr>
-        <w:spacing w:after="170" w:line="288"/>
-        <w:jc w:val="left"/>
-      </w:pPr>
-      <w:r>
-        <w:rPr>
-          <w:rFonts w:ascii="Arial" w:cs="Arial" w:eastAsia="Arial" w:hAnsi="Arial"/>
-          <w:sz w:val="21"/>
-          <w:szCs w:val="21"/>
-        </w:rPr>
-        <w:t xml:space="preserve">So I spent six hours pulling everything we know, our programs, our pitch, our objection handling, and our funnel logic, into one sequenced curriculum, then taught myself to build on top of it with Claude. Two to three weeks later I had shipped an AI onboarding platform where a joiner runs live voice mock calls against an AI buyer, is scored on the pitch automatically, and gets coaching after every attempt, including on their real calls once they go live. Managers get a dashboard of mock-call volume, scores, strengths, gaps, and next steps. It is now formally recognised and rolling out, beginning with Hyderabad.</w:t>
-      </w:r>
-    </w:p>
-    <w:p>
-      <w:pPr>
-        <w:spacing w:after="170" w:line="288"/>
-        <w:jc w:val="left"/>
-      </w:pPr>
-      <w:r>
-        <w:rPr>
-          <w:rFonts w:ascii="Arial" w:cs="Arial" w:eastAsia="Arial" w:hAnsi="Arial"/>
-          <w:sz w:val="21"/>
-          <w:szCs w:val="21"/>
-        </w:rPr>
-        <w:t xml:space="preserve">That build showed me what I actually want to do, because none of it was a sales task. It was curriculum design, learning experience design, and assessment design. And I did not stop there. I rebuilt Day-1 into a sixteen-session program across eight functions, gave every session an owner and a time slot, and briefed each owner on what theirs had to cover. Then I wrote the company induction, the POSH and leave modules, and a full five-program curriculum reference mapping our funnel stages, program structures, and learner pathways.</w:t>
-      </w:r>
-    </w:p>
-    <w:p>
-      <w:pPr>
-        <w:spacing w:after="170" w:line="288"/>
-        <w:jc w:val="left"/>
-      </w:pPr>
-      <w:r>
-        <w:rPr>
-          <w:rFonts w:ascii="Arial" w:cs="Arial" w:eastAsia="Arial" w:hAnsi="Arial"/>
-          <w:sz w:val="21"/>
-          <w:szCs w:val="21"/>
-        </w:rPr>
-        <w:t xml:space="preserve">I built all of it because "be an owner, not a renter" is not a poster to me, it is simply how I work. And I want the Programs Team specifically because the parts I enjoyed most are exactly what Programs does every day: deciding what should be taught, shaping it into a curriculum, designing how a learner moves through it, and running delivery so nothing slips.</w:t>
-      </w:r>
-    </w:p>
-    <w:p>
-      <w:pPr>
-        <w:spacing w:after="170" w:line="288"/>
-        <w:jc w:val="left"/>
-      </w:pPr>
-      <w:r>
-        <w:rPr>
-          <w:rFonts w:ascii="Arial" w:cs="Arial" w:eastAsia="Arial" w:hAnsi="Arial"/>
-          <w:sz w:val="21"/>
-          <w:szCs w:val="21"/>
-        </w:rPr>
-        <w:t xml:space="preserve">For an early-career hire I would bring an unusual mix. I know our programs commercially because I have sold them, so I understand why a learner picks the Accelerator over a Fellowship and what they expect on arrival. I can design and build a learning experience without waiting on design or engineering. And I work from data by default, from the Dial Nexa dashboard to the weekly revenue and funnel analysis I run for the Senior Manager, Business Operations and the Associate Director, Growth.</w:t>
-      </w:r>
-    </w:p>
-    <w:p>
-      <w:pPr>
-        <w:spacing w:after="170" w:line="288"/>
-        <w:jc w:val="left"/>
-      </w:pPr>
-      <w:r>
-        <w:rPr>
-          <w:rFonts w:ascii="Arial" w:cs="Arial" w:eastAsia="Arial" w:hAnsi="Arial"/>
-          <w:sz w:val="21"/>
-          <w:szCs w:val="21"/>
-        </w:rPr>
-        <w:t xml:space="preserve">I have spent three months doing Programs work quietly, next to my quota. I would like to do it properly and full-time, for the learners it is all meant for.</w:t>
-      </w:r>
-    </w:p>
-    <w:p>
-      <w:pPr>
-        <w:spacing w:after="170" w:line="288"/>
-        <w:jc w:val="left"/>
-      </w:pPr>
-      <w:r>
-        <w:rPr>
-          <w:rFonts w:ascii="Arial" w:cs="Arial" w:eastAsia="Arial" w:hAnsi="Arial"/>
-          <w:sz w:val="21"/>
-          <w:szCs w:val="21"/>
-        </w:rPr>
-        <w:t xml:space="preserve">Thank you for reading. I would love to walk you through the platform and what I would build next.</w:t>
-      </w:r>
-    </w:p>
-    <w:p>
-      <w:pPr>
-        <w:spacing w:after="0" w:before="60"/>
-      </w:pPr>
-      <w:r>
-        <w:rPr>
-          <w:rFonts w:ascii="Arial" w:cs="Arial" w:eastAsia="Arial" w:hAnsi="Arial"/>
-          <w:sz w:val="21"/>
-          <w:szCs w:val="21"/>
+        <w:t xml:space="preserve">24 July 2026</w:t>
+      </w:r>
+    </w:p>
+    <w:p>
+      <w:pPr>
+        <w:spacing w:after="180"/>
+      </w:pPr>
+      <w:r>
+        <w:rPr>
+          <w:rFonts w:ascii="Arial" w:cs="Arial" w:eastAsia="Arial" w:hAnsi="Arial"/>
+          <w:sz w:val="23"/>
+          <w:szCs w:val="23"/>
+        </w:rPr>
+        <w:t xml:space="preserve">Dear Programs Team,</w:t>
+      </w:r>
+    </w:p>
+    <w:p>
+      <w:pPr>
+        <w:spacing w:after="200" w:line="330"/>
+        <w:jc w:val="left"/>
+      </w:pPr>
+      <w:r>
+        <w:rPr>
+          <w:rFonts w:ascii="Arial" w:cs="Arial" w:eastAsia="Arial" w:hAnsi="Arial"/>
+          <w:sz w:val="23"/>
+          <w:szCs w:val="23"/>
+        </w:rPr>
+        <w:t xml:space="preserve">In my first full sales cycle at GrowthSchool / Outskill, I delivered Rs. 9.7 lakh against a Rs. 7.5 lakh target and finished in the top 7 of our roughly 30-person sales team. Alongside that quota, I built something nobody asked me to build, and it is the reason I am writing to you.</w:t>
+      </w:r>
+    </w:p>
+    <w:p>
+      <w:pPr>
+        <w:spacing w:after="200" w:line="330"/>
+        <w:jc w:val="left"/>
+      </w:pPr>
+      <w:r>
+        <w:rPr>
+          <w:rFonts w:ascii="Arial" w:cs="Arial" w:eastAsia="Arial" w:hAnsi="Arial"/>
+          <w:sz w:val="23"/>
+          <w:szCs w:val="23"/>
+        </w:rPr>
+        <w:t xml:space="preserve">Here is what I noticed. Every new hire went through hand-to-hand training: a senior rep or a manager sitting through repeated mock calls to build pitch and product knowledge from scratch. A batch of 8 to 10 hires would take close to a week of that dedicated senior and manager time, inside a two-week onboarding window. It pulled our strongest closers off the phones, and every joiner still reached the floor with a slightly different version of the pitch. I decided to fix it, on my own time, next to my target.</w:t>
+      </w:r>
+    </w:p>
+    <w:p>
+      <w:pPr>
+        <w:spacing w:after="200" w:line="330"/>
+        <w:jc w:val="left"/>
+      </w:pPr>
+      <w:r>
+        <w:rPr>
+          <w:rFonts w:ascii="Arial" w:cs="Arial" w:eastAsia="Arial" w:hAnsi="Arial"/>
+          <w:sz w:val="23"/>
+          <w:szCs w:val="23"/>
+        </w:rPr>
+        <w:t xml:space="preserve">I spent more than six hours walking Claude through everything we do: our programs, our pitch structure, our objection handling, our pricing and payment flows, and our funnel logic. Over the next 15 to 20 days I built an AI sales-training platform. A new hire runs live voice mock calls against AI buyers that escalate from peer to director level, roughly 8 calls of 25 to 30 minutes each before any self-practice, gets the pitch scored automatically, and receives coaching after every attempt. The platform also runs knowledge-check quizzes on programs and pricing, and once a hire goes live it records their real calls and generates a follow-up report. Managers get a dashboard for every trainee showing mock-call volume, scores, strengths, gaps, and next steps.</w:t>
+      </w:r>
+    </w:p>
+    <w:p>
+      <w:pPr>
+        <w:spacing w:after="200" w:line="330"/>
+        <w:jc w:val="left"/>
+      </w:pPr>
+      <w:r>
+        <w:rPr>
+          <w:rFonts w:ascii="Arial" w:cs="Arial" w:eastAsia="Arial" w:hAnsi="Arial"/>
+          <w:sz w:val="23"/>
+          <w:szCs w:val="23"/>
+        </w:rPr>
+        <w:t xml:space="preserve">The platform is now formally recognised, and training has started on it at our new Hyderabad office, which currently has 15 to 20 hires with more joining. Beyond the time it gives back to seniors and managers, it lets every new hire practise against a range of buyer personas repeatedly, in a way that was never realistic one-on-one.</w:t>
+      </w:r>
+    </w:p>
+    <w:p>
+      <w:pPr>
+        <w:spacing w:after="200" w:line="330"/>
+        <w:jc w:val="left"/>
+      </w:pPr>
+      <w:r>
+        <w:rPr>
+          <w:rFonts w:ascii="Arial" w:cs="Arial" w:eastAsia="Arial" w:hAnsi="Arial"/>
+          <w:sz w:val="23"/>
+          <w:szCs w:val="23"/>
+        </w:rPr>
+        <w:t xml:space="preserve">I did not stop at the platform. I was given the schedule for Hyderabad's Day 1 and built the full deck for it. Separately, I authored the company induction deck for HR to present during onboarding, the leave and attendance policy deck, the POSH policy deck, and a programs deck that walks through what the company does, how we sell, and how our teams operate end to end. All five are live and in active use for onboarding. I also worked with HR through the Hyderabad launch, sending personalised welcome emails to the 15 new joiners there.</w:t>
+      </w:r>
+    </w:p>
+    <w:p>
+      <w:pPr>
+        <w:spacing w:after="200" w:line="330"/>
+        <w:jc w:val="left"/>
+      </w:pPr>
+      <w:r>
+        <w:rPr>
+          <w:rFonts w:ascii="Arial" w:cs="Arial" w:eastAsia="Arial" w:hAnsi="Arial"/>
+          <w:sz w:val="23"/>
+          <w:szCs w:val="23"/>
+        </w:rPr>
+        <w:t xml:space="preserve">That build showed me what I actually want to do, because very little of it was a sales task. It was curriculum design, learning experience design, and assessment design. On the data side, I converted our Dial Nexa dialler tracking, which used to be manual, into an automated Google Sheets dashboard that gives individual-agent and team-level views, now used directly by the Senior Manager, Business Operations and the Associate Director, Growth. I also built and maintain a daily revenue and funnel report comparing domestic, international, and overall performance, that is leads, workshop show-ups, conversions, units sold, and revenue, against a rolling three to four month baseline.</w:t>
+      </w:r>
+    </w:p>
+    <w:p>
+      <w:pPr>
+        <w:spacing w:after="200" w:line="330"/>
+        <w:jc w:val="left"/>
+      </w:pPr>
+      <w:r>
+        <w:rPr>
+          <w:rFonts w:ascii="Arial" w:cs="Arial" w:eastAsia="Arial" w:hAnsi="Arial"/>
+          <w:sz w:val="23"/>
+          <w:szCs w:val="23"/>
+        </w:rPr>
+        <w:t xml:space="preserve">Programs draw on more than one kind of muscle, so I will tell you the rest of how I work. As Director of UDAAN, CHRIST University's Entrepreneurship Cell, I ran 15+ events including INNOWAVE 2025, a three-day international conference, where I onboarded speakers, secured sponsorships, and authored a nationally published feature in The Hindu. I co-founded NoteFi, a peer-to-peer academic resource platform with DRM-protected content that currently generates revenue, and I was a founding member of IdeaFi, where we secured funding and strategic support from GradCapital. Different rooms, same instinct: find the gap, design the fix, and ship it.</w:t>
+      </w:r>
+    </w:p>
+    <w:p>
+      <w:pPr>
+        <w:spacing w:after="200" w:line="330"/>
+        <w:jc w:val="left"/>
+      </w:pPr>
+      <w:r>
+        <w:rPr>
+          <w:rFonts w:ascii="Arial" w:cs="Arial" w:eastAsia="Arial" w:hAnsi="Arial"/>
+          <w:sz w:val="23"/>
+          <w:szCs w:val="23"/>
+        </w:rPr>
+        <w:t xml:space="preserve">I want the Programs Team specifically because the parts I enjoyed most while building all of this, deciding what should be taught, shaping it into a usable curriculum, designing how a learner moves through it, and making sure delivery does not slip, are exactly what Programs do every day.</w:t>
+      </w:r>
+    </w:p>
+    <w:p>
+      <w:pPr>
+        <w:spacing w:after="200" w:line="330"/>
+        <w:jc w:val="left"/>
+      </w:pPr>
+      <w:r>
+        <w:rPr>
+          <w:rFonts w:ascii="Arial" w:cs="Arial" w:eastAsia="Arial" w:hAnsi="Arial"/>
+          <w:sz w:val="23"/>
+          <w:szCs w:val="23"/>
+        </w:rPr>
+        <w:t xml:space="preserve">For an early-career hire, I believe I bring an unusual combination. I understand our programs commercially because I have sold them, so I know why a learner picks one path over another and what they expect on arrival. I can design and build a learning experience without waiting on a design or engineering team. And I work from data by default, whether that is the Dial Nexa dashboard or the weekly revenue and funnel analysis I already run for senior stakeholders.</w:t>
+      </w:r>
+    </w:p>
+    <w:p>
+      <w:pPr>
+        <w:spacing w:after="200" w:line="330"/>
+        <w:jc w:val="left"/>
+      </w:pPr>
+      <w:r>
+        <w:rPr>
+          <w:rFonts w:ascii="Arial" w:cs="Arial" w:eastAsia="Arial" w:hAnsi="Arial"/>
+          <w:sz w:val="23"/>
+          <w:szCs w:val="23"/>
+        </w:rPr>
+        <w:t xml:space="preserve">I have spent the last three months doing Programs work quietly, next to my quota. I would like the chance to do it properly and full-time, for the learners it is all meant for. Thank you for reading, and I would welcome the chance to walk you through the platform and what I would build next.</w:t>
+      </w:r>
+    </w:p>
+    <w:p>
+      <w:pPr>
+        <w:spacing w:after="0" w:before="40"/>
+      </w:pPr>
+      <w:r>
+        <w:rPr>
+          <w:rFonts w:ascii="Arial" w:cs="Arial" w:eastAsia="Arial" w:hAnsi="Arial"/>
+          <w:sz w:val="23"/>
+          <w:szCs w:val="23"/>
         </w:rPr>
         <w:t xml:space="preserve">Warm regards,</w:t>
       </w:r>
@@ -198,8 +226,8 @@
           <w:b/>
           <w:bCs/>
           <w:color w:val="1A1A1A"/>
-          <w:sz w:val="21"/>
-          <w:szCs w:val="21"/>
+          <w:sz w:val="23"/>
+          <w:szCs w:val="23"/>
         </w:rPr>
         <w:t xml:space="preserve">Garvit Saraf</w:t>
       </w:r>
@@ -209,7 +237,7 @@
         <w:pBdr>
           <w:top w:val="single" w:color="B9C4D4" w:sz="5"/>
         </w:pBdr>
-        <w:spacing w:after="40" w:before="60"/>
+        <w:spacing w:after="45" w:before="40"/>
       </w:pPr>
       <w:r>
         <w:rPr>
@@ -217,122 +245,189 @@
           <w:b/>
           <w:bCs/>
           <w:color w:val="1C3A5E"/>
-          <w:spacing w:val="20"/>
-          <w:sz w:val="16"/>
-          <w:szCs w:val="16"/>
+          <w:spacing w:val="18"/>
+          <w:sz w:val="15"/>
+          <w:szCs w:val="15"/>
         </w:rPr>
         <w:t xml:space="preserve">SEE THE WORK, LIVE</w:t>
       </w:r>
     </w:p>
     <w:p>
       <w:pPr>
-        <w:spacing w:after="30"/>
-      </w:pPr>
+        <w:spacing w:after="25"/>
+      </w:pPr>
+      <w:r>
+        <w:rPr>
+          <w:rFonts w:ascii="Arial" w:cs="Arial" w:eastAsia="Arial" w:hAnsi="Arial"/>
+          <w:b/>
+          <w:bCs/>
+          <w:color w:val="1A1A1A"/>
+          <w:sz w:val="16"/>
+          <w:szCs w:val="16"/>
+        </w:rPr>
+        <w:t xml:space="preserve">Sales-training platform </w:t>
+      </w:r>
       <w:r>
         <w:rPr>
           <w:rFonts w:ascii="Arial" w:cs="Arial" w:eastAsia="Arial" w:hAnsi="Arial"/>
           <w:color w:val="5C5C5C"/>
-          <w:sz w:val="17"/>
-          <w:szCs w:val="17"/>
-        </w:rPr>
-        <w:t xml:space="preserve">Onboarding platform and mock-call demo: </w:t>
-      </w:r>
-      <w:hyperlink w:history="1" r:id="rIdkftfqasdhniul2gvsld7q">
+          <w:sz w:val="16"/>
+          <w:szCs w:val="16"/>
+        </w:rPr>
+        <w:t xml:space="preserve">(live mock calls, scoring, coaching, manager dashboard): </w:t>
+      </w:r>
+      <w:hyperlink w:history="1" r:id="rId5nwhz-vr15oxtsvso1qws">
         <w:r>
           <w:rPr>
             <w:rFonts w:ascii="Arial" w:cs="Arial" w:eastAsia="Arial" w:hAnsi="Arial"/>
             <w:color w:val="1C3A5E"/>
-            <w:sz w:val="17"/>
-            <w:szCs w:val="17"/>
+            <w:sz w:val="16"/>
+            <w:szCs w:val="16"/>
             <w:u w:val="single"/>
           </w:rPr>
-          <w:t xml:space="preserve">outskill-garvit.vercel.app</w:t>
+          <w:t xml:space="preserve">https://outskill-garvit.vercel.app</w:t>
         </w:r>
       </w:hyperlink>
     </w:p>
     <w:p>
       <w:pPr>
-        <w:spacing w:after="0"/>
-      </w:pPr>
+        <w:spacing w:after="25"/>
+      </w:pPr>
+      <w:r>
+        <w:rPr>
+          <w:rFonts w:ascii="Arial" w:cs="Arial" w:eastAsia="Arial" w:hAnsi="Arial"/>
+          <w:b/>
+          <w:bCs/>
+          <w:color w:val="1A1A1A"/>
+          <w:sz w:val="16"/>
+          <w:szCs w:val="16"/>
+        </w:rPr>
+        <w:t xml:space="preserve">Programs deck </w:t>
+      </w:r>
       <w:r>
         <w:rPr>
           <w:rFonts w:ascii="Arial" w:cs="Arial" w:eastAsia="Arial" w:hAnsi="Arial"/>
           <w:color w:val="5C5C5C"/>
-          <w:sz w:val="17"/>
-          <w:szCs w:val="17"/>
-        </w:rPr>
-        <w:t xml:space="preserve">Day-1 program: </w:t>
-      </w:r>
-      <w:hyperlink w:history="1" r:id="rIdmcmnfnh6ekfkk0nv3an-h">
+          <w:sz w:val="16"/>
+          <w:szCs w:val="16"/>
+        </w:rPr>
+        <w:t xml:space="preserve">(what we do, how we sell, how the teams work): </w:t>
+      </w:r>
+      <w:hyperlink w:history="1" r:id="rIdaljso5-s1dmalrp3o5gx3">
         <w:r>
           <w:rPr>
             <w:rFonts w:ascii="Arial" w:cs="Arial" w:eastAsia="Arial" w:hAnsi="Arial"/>
             <w:color w:val="1C3A5E"/>
-            <w:sz w:val="17"/>
-            <w:szCs w:val="17"/>
+            <w:sz w:val="16"/>
+            <w:szCs w:val="16"/>
             <w:u w:val="single"/>
           </w:rPr>
-          <w:t xml:space="preserve">/day1</w:t>
+          <w:t xml:space="preserve">https://outskill-garvit.vercel.app/programs</w:t>
         </w:r>
       </w:hyperlink>
-      <w:r>
-        <w:rPr>
-          <w:rFonts w:ascii="Arial" w:cs="Arial" w:eastAsia="Arial" w:hAnsi="Arial"/>
-          <w:color w:val="5C5C5C"/>
-          <w:sz w:val="17"/>
-          <w:szCs w:val="17"/>
-        </w:rPr>
-        <w:t xml:space="preserve">   |   Company induction: </w:t>
-      </w:r>
-      <w:hyperlink w:history="1" r:id="rIdxo-ewonkezbj2o8_tn5eh">
+    </w:p>
+    <w:p>
+      <w:pPr>
+        <w:spacing w:after="25"/>
+      </w:pPr>
+      <w:r>
+        <w:rPr>
+          <w:rFonts w:ascii="Arial" w:cs="Arial" w:eastAsia="Arial" w:hAnsi="Arial"/>
+          <w:b/>
+          <w:bCs/>
+          <w:color w:val="1A1A1A"/>
+          <w:sz w:val="16"/>
+          <w:szCs w:val="16"/>
+        </w:rPr>
+        <w:t xml:space="preserve">Company induction deck: </w:t>
+      </w:r>
+      <w:hyperlink w:history="1" r:id="rIdp2o6ffecihqlw73sbjald">
         <w:r>
           <w:rPr>
             <w:rFonts w:ascii="Arial" w:cs="Arial" w:eastAsia="Arial" w:hAnsi="Arial"/>
             <w:color w:val="1C3A5E"/>
-            <w:sz w:val="17"/>
-            <w:szCs w:val="17"/>
+            <w:sz w:val="16"/>
+            <w:szCs w:val="16"/>
             <w:u w:val="single"/>
           </w:rPr>
-          <w:t xml:space="preserve">/induction</w:t>
+          <w:t xml:space="preserve">https://outskill-garvit.vercel.app/induction</w:t>
         </w:r>
       </w:hyperlink>
       <w:r>
         <w:rPr>
           <w:rFonts w:ascii="Arial" w:cs="Arial" w:eastAsia="Arial" w:hAnsi="Arial"/>
-          <w:color w:val="5C5C5C"/>
-          <w:sz w:val="17"/>
-          <w:szCs w:val="17"/>
-        </w:rPr>
-        <w:t xml:space="preserve">   |   Curriculum reference: </w:t>
-      </w:r>
-      <w:hyperlink w:history="1" r:id="rId1w7-1h12zvojhmonk21gj">
+          <w:sz w:val="16"/>
+          <w:szCs w:val="16"/>
+        </w:rPr>
+        <w:t xml:space="preserve">    </w:t>
+      </w:r>
+      <w:r>
+        <w:rPr>
+          <w:rFonts w:ascii="Arial" w:cs="Arial" w:eastAsia="Arial" w:hAnsi="Arial"/>
+          <w:b/>
+          <w:bCs/>
+          <w:color w:val="1A1A1A"/>
+          <w:sz w:val="16"/>
+          <w:szCs w:val="16"/>
+        </w:rPr>
+        <w:t xml:space="preserve">Day-1 schedule deck: </w:t>
+      </w:r>
+      <w:hyperlink w:history="1" r:id="rIdl7tekzugkob56zooqtav9">
         <w:r>
           <w:rPr>
             <w:rFonts w:ascii="Arial" w:cs="Arial" w:eastAsia="Arial" w:hAnsi="Arial"/>
             <w:color w:val="1C3A5E"/>
-            <w:sz w:val="17"/>
-            <w:szCs w:val="17"/>
+            <w:sz w:val="16"/>
+            <w:szCs w:val="16"/>
             <w:u w:val="single"/>
           </w:rPr>
-          <w:t xml:space="preserve">/programs</w:t>
+          <w:t xml:space="preserve">https://outskill-garvit.vercel.app/day1</w:t>
         </w:r>
       </w:hyperlink>
-      <w:r>
-        <w:rPr>
-          <w:rFonts w:ascii="Arial" w:cs="Arial" w:eastAsia="Arial" w:hAnsi="Arial"/>
-          <w:color w:val="5C5C5C"/>
-          <w:sz w:val="17"/>
-          <w:szCs w:val="17"/>
-        </w:rPr>
-        <w:t xml:space="preserve">   |   Policy modules: </w:t>
-      </w:r>
-      <w:hyperlink w:history="1" r:id="rIdtqb_oqqblz2cso2bwnt5s">
+    </w:p>
+    <w:p>
+      <w:pPr>
+        <w:spacing w:after="0"/>
+      </w:pPr>
+      <w:r>
+        <w:rPr>
+          <w:rFonts w:ascii="Arial" w:cs="Arial" w:eastAsia="Arial" w:hAnsi="Arial"/>
+          <w:b/>
+          <w:bCs/>
+          <w:color w:val="1A1A1A"/>
+          <w:sz w:val="16"/>
+          <w:szCs w:val="16"/>
+        </w:rPr>
+        <w:t xml:space="preserve">Policy decks: </w:t>
+      </w:r>
+      <w:hyperlink w:history="1" r:id="rIdafvajb-x2vygthgdowvat">
         <w:r>
           <w:rPr>
             <w:rFonts w:ascii="Arial" w:cs="Arial" w:eastAsia="Arial" w:hAnsi="Arial"/>
             <w:color w:val="1C3A5E"/>
-            <w:sz w:val="17"/>
-            <w:szCs w:val="17"/>
+            <w:sz w:val="16"/>
+            <w:szCs w:val="16"/>
+            <w:u w:val="single"/>
+          </w:rPr>
+          <w:t xml:space="preserve">/leave</w:t>
+        </w:r>
+      </w:hyperlink>
+      <w:r>
+        <w:rPr>
+          <w:rFonts w:ascii="Arial" w:cs="Arial" w:eastAsia="Arial" w:hAnsi="Arial"/>
+          <w:color w:val="5C5C5C"/>
+          <w:sz w:val="16"/>
+          <w:szCs w:val="16"/>
+        </w:rPr>
+        <w:t xml:space="preserve"> (leave and attendance)    </w:t>
+      </w:r>
+      <w:hyperlink w:history="1" r:id="rIdzegyi2lo1uiysh85ejufy">
+        <w:r>
+          <w:rPr>
+            <w:rFonts w:ascii="Arial" w:cs="Arial" w:eastAsia="Arial" w:hAnsi="Arial"/>
+            <w:color w:val="1C3A5E"/>
+            <w:sz w:val="16"/>
+            <w:szCs w:val="16"/>
             <w:u w:val="single"/>
           </w:rPr>
           <w:t xml:space="preserve">/posh</w:t>
@@ -342,27 +437,15 @@
         <w:rPr>
           <w:rFonts w:ascii="Arial" w:cs="Arial" w:eastAsia="Arial" w:hAnsi="Arial"/>
           <w:color w:val="5C5C5C"/>
-          <w:sz w:val="17"/>
-          <w:szCs w:val="17"/>
-        </w:rPr>
-        <w:t xml:space="preserve">, </w:t>
-      </w:r>
-      <w:hyperlink w:history="1" r:id="rIdutkbaqkyork6mnoiyzxyy">
-        <w:r>
-          <w:rPr>
-            <w:rFonts w:ascii="Arial" w:cs="Arial" w:eastAsia="Arial" w:hAnsi="Arial"/>
-            <w:color w:val="1C3A5E"/>
-            <w:sz w:val="17"/>
-            <w:szCs w:val="17"/>
-            <w:u w:val="single"/>
-          </w:rPr>
-          <w:t xml:space="preserve">/leave</w:t>
-        </w:r>
-      </w:hyperlink>
+          <w:sz w:val="16"/>
+          <w:szCs w:val="16"/>
+        </w:rPr>
+        <w:t xml:space="preserve"> (POSH)</w:t>
+      </w:r>
     </w:p>
     <w:sectPr>
       <w:pgSz w:w="11906" w:h="16838" w:orient="portrait"/>
-      <w:pgMar w:top="850" w:right="1120" w:bottom="780" w:left="1120" w:header="708" w:footer="708" w:gutter="0"/>
+      <w:pgMar w:top="1080" w:right="1150" w:bottom="1080" w:left="1150" w:header="708" w:footer="708" w:gutter="0"/>
       <w:pgNumType/>
       <w:docGrid w:linePitch="360"/>
     </w:sectPr>
@@ -543,8 +626,8 @@
       <w:lvlJc w:val="left"/>
       <w:rPr>
         <w:color w:val="1C3A5E"/>
-        <w:sz w:val="16"/>
-        <w:szCs w:val="16"/>
+        <w:sz w:val="15"/>
+        <w:szCs w:val="15"/>
       </w:rPr>
     </w:lvl>
   </w:abstractNum>
@@ -563,9 +646,9 @@
     <w:rPrDefault>
       <w:rPr>
         <w:rFonts w:ascii="Arial" w:cs="Arial" w:eastAsia="Arial" w:hAnsi="Arial"/>
-        <w:color w:val="252525"/>
-        <w:sz w:val="21"/>
-        <w:szCs w:val="21"/>
+        <w:color w:val="242424"/>
+        <w:sz w:val="23"/>
+        <w:szCs w:val="23"/>
       </w:rPr>
     </w:rPrDefault>
     <w:pPrDefault/>

</xml_diff>